<commit_message>
Revised moored sensor processing logsheet
</commit_message>
<xml_diff>
--- a/Documents/logsheets_blank/YYXXX_m_moorproc.docx
+++ b/Documents/logsheets_blank/YYXXX_m_moorproc.docx
@@ -20,7 +20,19 @@
         <w:rPr>
           <w:b/>
         </w:rPr>
-        <w:t>Cast number</w:t>
+        <w:t>Mooring</w:t>
+      </w:r>
+      <w:r>
+        <w:rPr>
+          <w:b/>
+        </w:rPr>
+        <w:t xml:space="preserve"> </w:t>
+      </w:r>
+      <w:r>
+        <w:rPr>
+          <w:b/>
+        </w:rPr>
+        <w:t>ID</w:t>
       </w:r>
       <w:r>
         <w:rPr>
@@ -47,6 +59,7 @@
         <w:tab/>
       </w:r>
       <w:proofErr w:type="spellStart"/>
+      <w:proofErr w:type="gramStart"/>
       <w:r>
         <w:rPr>
           <w:b/>
@@ -64,7 +77,14 @@
         <w:rPr>
           <w:b/>
         </w:rPr>
-        <w:t>_____________</w:t>
+        <w:t>_</w:t>
+      </w:r>
+      <w:proofErr w:type="gramEnd"/>
+      <w:r>
+        <w:rPr>
+          <w:b/>
+        </w:rPr>
+        <w:t>____________</w:t>
       </w:r>
       <w:r>
         <w:rPr>
@@ -78,6 +98,7 @@
         </w:rPr>
         <w:t xml:space="preserve"> </w:t>
       </w:r>
+      <w:proofErr w:type="gramStart"/>
       <w:r>
         <w:rPr>
           <w:b/>
@@ -88,7 +109,14 @@
         <w:rPr>
           <w:b/>
         </w:rPr>
-        <w:t>_______________</w:t>
+        <w:t>_</w:t>
+      </w:r>
+      <w:proofErr w:type="gramEnd"/>
+      <w:r>
+        <w:rPr>
+          <w:b/>
+        </w:rPr>
+        <w:t>______________</w:t>
       </w:r>
       <w:r>
         <w:rPr>
@@ -101,13 +129,26 @@
           <w:b/>
         </w:rPr>
         <w:tab/>
+      </w:r>
+      <w:proofErr w:type="gramStart"/>
+      <w:r>
+        <w:rPr>
+          <w:b/>
+        </w:rPr>
         <w:t xml:space="preserve">Longitude  </w:t>
       </w:r>
       <w:r>
         <w:rPr>
           <w:b/>
         </w:rPr>
-        <w:t>_______________</w:t>
+        <w:t>_</w:t>
+      </w:r>
+      <w:proofErr w:type="gramEnd"/>
+      <w:r>
+        <w:rPr>
+          <w:b/>
+        </w:rPr>
+        <w:t>______________</w:t>
       </w:r>
       <w:r>
         <w:rPr>
@@ -145,13 +186,27 @@
         <w:rPr>
           <w:b/>
         </w:rPr>
-        <w:t>Deploy (HH:MM DD/MM/YYY)</w:t>
-      </w:r>
-      <w:r>
-        <w:rPr>
-          <w:b/>
-        </w:rPr>
-        <w:t xml:space="preserve"> ___________________</w:t>
+        <w:t>Deploy (HH:MM DD/MM/</w:t>
+      </w:r>
+      <w:proofErr w:type="gramStart"/>
+      <w:r>
+        <w:rPr>
+          <w:b/>
+        </w:rPr>
+        <w:t>YYY)</w:t>
+      </w:r>
+      <w:r>
+        <w:rPr>
+          <w:b/>
+        </w:rPr>
+        <w:t xml:space="preserve"> ___</w:t>
+      </w:r>
+      <w:proofErr w:type="gramEnd"/>
+      <w:r>
+        <w:rPr>
+          <w:b/>
+        </w:rPr>
+        <w:t>________________</w:t>
       </w:r>
       <w:r>
         <w:rPr>
@@ -169,7 +224,14 @@
         <w:rPr>
           <w:b/>
         </w:rPr>
-        <w:t xml:space="preserve"> ___________________</w:t>
+        <w:t xml:space="preserve"> __________________</w:t>
+      </w:r>
+      <w:proofErr w:type="gramStart"/>
+      <w:r>
+        <w:rPr>
+          <w:b/>
+        </w:rPr>
+        <w:t>_</w:t>
       </w:r>
       <w:r>
         <w:rPr>
@@ -181,7 +243,14 @@
         <w:rPr>
           <w:b/>
         </w:rPr>
-        <w:t xml:space="preserve"> Operator </w:t>
+        <w:t xml:space="preserve"> Operator</w:t>
+      </w:r>
+      <w:proofErr w:type="gramEnd"/>
+      <w:r>
+        <w:rPr>
+          <w:b/>
+        </w:rPr>
+        <w:t xml:space="preserve"> </w:t>
       </w:r>
       <w:r>
         <w:rPr>
@@ -658,7 +727,15 @@
           </w:tcPr>
           <w:p>
             <w:r>
-              <w:t>Create &lt;moor&gt;info.dat file</w:t>
+              <w:t>Create &lt;</w:t>
+            </w:r>
+            <w:proofErr w:type="gramStart"/>
+            <w:r>
+              <w:t>moor</w:t>
+            </w:r>
+            <w:proofErr w:type="gramEnd"/>
+            <w:r>
+              <w:t>&gt;info.dat file</w:t>
             </w:r>
           </w:p>
         </w:tc>
@@ -1101,19 +1178,7 @@
               <w:rPr>
                 <w:rFonts w:ascii="Cambria" w:hAnsi="Cambria"/>
               </w:rPr>
-              <w:t>STAGE 1</w:t>
-            </w:r>
-            <w:r>
-              <w:rPr>
-                <w:rFonts w:ascii="Cambria" w:hAnsi="Cambria"/>
-              </w:rPr>
-              <w:t xml:space="preserve"> &amp; 2</w:t>
-            </w:r>
-            <w:r>
-              <w:rPr>
-                <w:rFonts w:ascii="Cambria" w:hAnsi="Cambria"/>
-              </w:rPr>
-              <w:t>:</w:t>
+              <w:t>STAGE 1 &amp; 2:</w:t>
             </w:r>
           </w:p>
           <w:p>
@@ -1321,7 +1386,7 @@
           <w:b/>
         </w:rPr>
         <w:lastRenderedPageBreak/>
-        <w:t>Cast number</w:t>
+        <w:t>Mooring ID</w:t>
       </w:r>
       <w:r>
         <w:rPr>
@@ -1348,6 +1413,7 @@
         <w:tab/>
       </w:r>
       <w:proofErr w:type="spellStart"/>
+      <w:proofErr w:type="gramStart"/>
       <w:r>
         <w:rPr>
           <w:b/>
@@ -1365,7 +1431,14 @@
         <w:rPr>
           <w:b/>
         </w:rPr>
-        <w:t>_____________</w:t>
+        <w:t>_</w:t>
+      </w:r>
+      <w:proofErr w:type="gramEnd"/>
+      <w:r>
+        <w:rPr>
+          <w:b/>
+        </w:rPr>
+        <w:t>____________</w:t>
       </w:r>
       <w:r>
         <w:rPr>
@@ -1379,6 +1452,7 @@
         </w:rPr>
         <w:t xml:space="preserve"> </w:t>
       </w:r>
+      <w:proofErr w:type="gramStart"/>
       <w:r>
         <w:rPr>
           <w:b/>
@@ -1389,7 +1463,14 @@
         <w:rPr>
           <w:b/>
         </w:rPr>
-        <w:t>_______________</w:t>
+        <w:t>_</w:t>
+      </w:r>
+      <w:proofErr w:type="gramEnd"/>
+      <w:r>
+        <w:rPr>
+          <w:b/>
+        </w:rPr>
+        <w:t>______________</w:t>
       </w:r>
       <w:r>
         <w:rPr>
@@ -1402,13 +1483,26 @@
           <w:b/>
         </w:rPr>
         <w:tab/>
+      </w:r>
+      <w:proofErr w:type="gramStart"/>
+      <w:r>
+        <w:rPr>
+          <w:b/>
+        </w:rPr>
         <w:t xml:space="preserve">Longitude  </w:t>
       </w:r>
       <w:r>
         <w:rPr>
           <w:b/>
         </w:rPr>
-        <w:t>_______________</w:t>
+        <w:t>_</w:t>
+      </w:r>
+      <w:proofErr w:type="gramEnd"/>
+      <w:r>
+        <w:rPr>
+          <w:b/>
+        </w:rPr>
+        <w:t>______________</w:t>
       </w:r>
       <w:r>
         <w:rPr>
@@ -1446,13 +1540,27 @@
         <w:rPr>
           <w:b/>
         </w:rPr>
-        <w:t>Deploy (HH:MM DD/MM/YYY)</w:t>
-      </w:r>
-      <w:r>
-        <w:rPr>
-          <w:b/>
-        </w:rPr>
-        <w:t xml:space="preserve"> ___________________</w:t>
+        <w:t>Deploy (HH:MM DD/MM/</w:t>
+      </w:r>
+      <w:proofErr w:type="gramStart"/>
+      <w:r>
+        <w:rPr>
+          <w:b/>
+        </w:rPr>
+        <w:t>YYY)</w:t>
+      </w:r>
+      <w:r>
+        <w:rPr>
+          <w:b/>
+        </w:rPr>
+        <w:t xml:space="preserve"> ___</w:t>
+      </w:r>
+      <w:proofErr w:type="gramEnd"/>
+      <w:r>
+        <w:rPr>
+          <w:b/>
+        </w:rPr>
+        <w:t>________________</w:t>
       </w:r>
       <w:r>
         <w:rPr>
@@ -1470,13 +1578,27 @@
         <w:rPr>
           <w:b/>
         </w:rPr>
-        <w:t xml:space="preserve"> ___________________</w:t>
-      </w:r>
-      <w:r>
-        <w:rPr>
-          <w:b/>
-        </w:rPr>
-        <w:t xml:space="preserve">  Operator </w:t>
+        <w:t xml:space="preserve"> __________________</w:t>
+      </w:r>
+      <w:proofErr w:type="gramStart"/>
+      <w:r>
+        <w:rPr>
+          <w:b/>
+        </w:rPr>
+        <w:t>_</w:t>
+      </w:r>
+      <w:r>
+        <w:rPr>
+          <w:b/>
+        </w:rPr>
+        <w:t xml:space="preserve">  Operator</w:t>
+      </w:r>
+      <w:proofErr w:type="gramEnd"/>
+      <w:r>
+        <w:rPr>
+          <w:b/>
+        </w:rPr>
+        <w:t xml:space="preserve"> </w:t>
       </w:r>
       <w:r>
         <w:rPr>
@@ -1953,7 +2075,15 @@
           </w:tcPr>
           <w:p>
             <w:r>
-              <w:t>Create &lt;moor&gt;info.dat file</w:t>
+              <w:t>Create &lt;</w:t>
+            </w:r>
+            <w:proofErr w:type="gramStart"/>
+            <w:r>
+              <w:t>moor</w:t>
+            </w:r>
+            <w:proofErr w:type="gramEnd"/>
+            <w:r>
+              <w:t>&gt;info.dat file</w:t>
             </w:r>
           </w:p>
         </w:tc>
@@ -2555,20 +2685,6 @@
         </w:rPr>
         <w:t>Comments:</w:t>
       </w:r>
-    </w:p>
-    <w:p>
-      <w:pPr>
-        <w:rPr>
-          <w:b/>
-        </w:rPr>
-      </w:pPr>
-    </w:p>
-    <w:p>
-      <w:pPr>
-        <w:rPr>
-          <w:b/>
-        </w:rPr>
-      </w:pPr>
     </w:p>
     <w:p>
       <w:pPr>
@@ -2712,6 +2828,7 @@
         <w:szCs w:val="28"/>
       </w:rPr>
     </w:pPr>
+    <w:proofErr w:type="gramStart"/>
     <w:r>
       <w:rPr>
         <w:b/>
@@ -2744,6 +2861,7 @@
       </w:rPr>
       <w:t>YYXXX</w:t>
     </w:r>
+    <w:proofErr w:type="gramEnd"/>
     <w:r>
       <w:tab/>
     </w:r>
@@ -3809,6 +3927,7 @@
     <w:rsid w:val="00920120"/>
     <w:rsid w:val="009D567C"/>
     <w:rsid w:val="00A034FD"/>
+    <w:rsid w:val="00A30745"/>
     <w:rsid w:val="00BA2BCC"/>
     <w:rsid w:val="00BE580E"/>
     <w:rsid w:val="00C1030C"/>

</xml_diff>